<commit_message>
outline of findings report
</commit_message>
<xml_diff>
--- a/lab_1/findings_report.docx
+++ b/lab_1/findings_report.docx
@@ -3,17 +3,79 @@
 <w:document xmlns:wpc="http://schemas.microsoft.com/office/word/2010/wordprocessingCanvas" xmlns:cx="http://schemas.microsoft.com/office/drawing/2014/chartex" xmlns:cx1="http://schemas.microsoft.com/office/drawing/2015/9/8/chartex" xmlns:cx2="http://schemas.microsoft.com/office/drawing/2015/10/21/chartex" xmlns:cx3="http://schemas.microsoft.com/office/drawing/2016/5/9/chartex" xmlns:cx4="http://schemas.microsoft.com/office/drawing/2016/5/10/chartex" xmlns:cx5="http://schemas.microsoft.com/office/drawing/2016/5/11/chartex" xmlns:cx6="http://schemas.microsoft.com/office/drawing/2016/5/12/chartex" xmlns:cx7="http://schemas.microsoft.com/office/drawing/2016/5/13/chartex" xmlns:cx8="http://schemas.microsoft.com/office/drawing/2016/5/14/chartex" xmlns:mc="http://schemas.openxmlformats.org/markup-compatibility/2006" xmlns:aink="http://schemas.microsoft.com/office/drawing/2016/ink" xmlns:am3d="http://schemas.microsoft.com/office/drawing/2017/model3d" xmlns:o="urn:schemas-microsoft-com:office:office" xmlns:oel="http://schemas.microsoft.com/office/2019/extlst" xmlns:r="http://schemas.openxmlformats.org/officeDocument/2006/relationships" xmlns:m="http://schemas.openxmlformats.org/officeDocument/2006/math" xmlns:v="urn:schemas-microsoft-com:vml" xmlns:wp14="http://schemas.microsoft.com/office/word/2010/wordprocessingDrawing" xmlns:wp="http://schemas.openxmlformats.org/drawingml/2006/wordprocessingDrawing" xmlns:w10="urn:schemas-microsoft-com:office:word" xmlns:w="http://schemas.openxmlformats.org/wordprocessingml/2006/main" xmlns:w14="http://schemas.microsoft.com/office/word/2010/wordml" xmlns:w15="http://schemas.microsoft.com/office/word/2012/wordml" xmlns:w16cex="http://schemas.microsoft.com/office/word/2018/wordml/cex" xmlns:w16cid="http://schemas.microsoft.com/office/word/2016/wordml/cid" xmlns:w16="http://schemas.microsoft.com/office/word/2018/wordml" xmlns:w16du="http://schemas.microsoft.com/office/word/2023/wordml/word16du" xmlns:w16sdtdh="http://schemas.microsoft.com/office/word/2020/wordml/sdtdatahash" xmlns:w16sdtfl="http://schemas.microsoft.com/office/word/2024/wordml/sdtformatlock" xmlns:w16se="http://schemas.microsoft.com/office/word/2015/wordml/symex" xmlns:wpg="http://schemas.microsoft.com/office/word/2010/wordprocessingGroup" xmlns:wpi="http://schemas.microsoft.com/office/word/2010/wordprocessingInk" xmlns:wne="http://schemas.microsoft.com/office/word/2006/wordml" xmlns:wps="http://schemas.microsoft.com/office/word/2010/wordprocessingShape" mc:Ignorable="w14 w15 w16se w16cid w16 w16cex w16sdtdh w16sdtfl w16du wp14">
   <w:body>
     <w:p>
+      <w:pPr>
+        <w:jc w:val="right"/>
+      </w:pPr>
       <w:r>
-        <w:t>Findings</w:t>
+        <w:t>Anna Phillips</w:t>
+      </w:r>
+    </w:p>
+    <w:p>
+      <w:pPr>
+        <w:rPr>
+          <w:sz w:val="28"/>
+          <w:szCs w:val="28"/>
+        </w:rPr>
+      </w:pPr>
+      <w:r>
+        <w:rPr>
+          <w:b/>
+          <w:bCs/>
+          <w:sz w:val="28"/>
+          <w:szCs w:val="28"/>
+        </w:rPr>
+        <w:t>Foreign Gifts Findings Report</w:t>
+      </w:r>
+      <w:r>
+        <w:rPr>
+          <w:b/>
+          <w:bCs/>
+          <w:sz w:val="28"/>
+          <w:szCs w:val="28"/>
+        </w:rPr>
+        <w:t>:</w:t>
+      </w:r>
+      <w:r>
+        <w:rPr>
+          <w:sz w:val="28"/>
+          <w:szCs w:val="28"/>
+        </w:rPr>
+        <w:t xml:space="preserve"> Foreign Funding Strategies for UVA</w:t>
+      </w:r>
+    </w:p>
+    <w:p>
+      <w:r>
+        <w:t>Executive Summary:</w:t>
       </w:r>
     </w:p>
     <w:p/>
+    <w:p>
+      <w:r>
+        <w:t>Analyses Summary:</w:t>
+      </w:r>
+    </w:p>
     <w:p/>
     <w:p>
       <w:r>
-        <w:t>3. In a document file (.doc, .docx, .pdf, etc.), summarize your findings:</w:t>
+        <w:t>Date range of gifts</w:t>
+      </w:r>
+      <w:r>
+        <w:t>?</w:t>
       </w:r>
     </w:p>
+    <w:p/>
+    <w:p>
+      <w:r>
+        <w:t>Proposed Strategy:</w:t>
+      </w:r>
+    </w:p>
+    <w:p/>
+    <w:p>
+      <w:r>
+        <w:t>Conclusion:</w:t>
+      </w:r>
+    </w:p>
+    <w:p/>
     <w:p>
       <w:r>
         <w:t>     1. Executive Summary: What are your main findings and recommendations, in a single paragraph?</w:t>
@@ -21,15 +83,7 @@
     </w:p>
     <w:p>
       <w:r>
-        <w:t xml:space="preserve">     2. Summarize the results of your initial </w:t>
-      </w:r>
-      <w:proofErr w:type="gramStart"/>
-      <w:r>
-        <w:t>analyses</w:t>
-      </w:r>
-      <w:proofErr w:type="gramEnd"/>
-      <w:r>
-        <w:t xml:space="preserve"> of overall giving and giving to UVA (1-3 paragraphs).</w:t>
+        <w:t>     2. Summarize the results of your initial analyses of overall giving and giving to UVA (1-3 paragraphs).</w:t>
       </w:r>
     </w:p>
     <w:p>

</xml_diff>

<commit_message>
add to summary section with breakdown of analysis logic and key outcomes
</commit_message>
<xml_diff>
--- a/lab_1/findings_report.docx
+++ b/lab_1/findings_report.docx
@@ -44,19 +44,1139 @@
       </w:r>
     </w:p>
     <w:p>
-      <w:r>
+      <w:pPr>
+        <w:rPr>
+          <w:b/>
+          <w:bCs/>
+        </w:rPr>
+      </w:pPr>
+      <w:r>
+        <w:rPr>
+          <w:b/>
+          <w:bCs/>
+        </w:rPr>
         <w:t>Executive Summary:</w:t>
       </w:r>
+      <w:r>
+        <w:t xml:space="preserve"> </w:t>
+      </w:r>
+      <w:r>
+        <w:rPr>
+          <w:b/>
+          <w:bCs/>
+        </w:rPr>
+        <w:t>What are your main findings and recommendations, in a single paragraph?</w:t>
+      </w:r>
+    </w:p>
+    <w:p>
+      <w:r>
+        <w:t xml:space="preserve">From my analysis of UVA, its Virginia peer institutions, and the market at large, </w:t>
+      </w:r>
+      <w:r>
+        <w:t xml:space="preserve">I found that UVA </w:t>
+      </w:r>
     </w:p>
     <w:p/>
     <w:p>
       <w:r>
+        <w:t>Uva has a strong, consistent gift flow foundation, but misses high funding opportunities shared by its fellow institutions</w:t>
+      </w:r>
+    </w:p>
+    <w:p>
+      <w:pPr>
+        <w:rPr>
+          <w:b/>
+          <w:bCs/>
+        </w:rPr>
+      </w:pPr>
+      <w:r>
+        <w:rPr>
+          <w:b/>
+          <w:bCs/>
+        </w:rPr>
         <w:t>Analyses Summary:</w:t>
       </w:r>
+      <w:r>
+        <w:rPr>
+          <w:b/>
+          <w:bCs/>
+        </w:rPr>
+        <w:t xml:space="preserve"> </w:t>
+      </w:r>
+      <w:r>
+        <w:rPr>
+          <w:b/>
+          <w:bCs/>
+        </w:rPr>
+        <w:t>Summarize the results of your initial analyses of overall giving and giving to UVA (1-3 paragraphs).</w:t>
+      </w:r>
+    </w:p>
+    <w:p>
+      <w:pPr>
+        <w:ind w:firstLine="720"/>
+      </w:pPr>
+      <w:r>
+        <w:t xml:space="preserve">Through the </w:t>
+      </w:r>
+      <w:r>
+        <w:rPr>
+          <w:i/>
+          <w:iCs/>
+        </w:rPr>
+        <w:t xml:space="preserve">Initial Analysis </w:t>
+      </w:r>
+      <w:r>
+        <w:t xml:space="preserve">portion of the lab, </w:t>
+      </w:r>
+      <w:r>
+        <w:t xml:space="preserve">we identified surface-level trends in the dataset </w:t>
+      </w:r>
+      <w:r>
+        <w:t xml:space="preserve">to </w:t>
+      </w:r>
+      <w:r>
+        <w:t xml:space="preserve">better equip us for deeper analysis for UVA. For example, our initial </w:t>
+      </w:r>
+      <w:r>
+        <w:t>analysis</w:t>
+      </w:r>
+      <w:r>
+        <w:t xml:space="preserve"> helped reveal top countries</w:t>
+      </w:r>
+      <w:r>
+        <w:t xml:space="preserve"> of giftors</w:t>
+      </w:r>
+      <w:r>
+        <w:t xml:space="preserve"> (by gift count and gift size), the distribution of gifts across US universities, </w:t>
+      </w:r>
+      <w:r>
+        <w:t xml:space="preserve">and </w:t>
+      </w:r>
+      <w:r>
+        <w:t>trends in gift size/amount</w:t>
+      </w:r>
+      <w:r>
+        <w:t xml:space="preserve">. </w:t>
+      </w:r>
+      <w:r>
+        <w:t xml:space="preserve">At first glance, this initial exploration </w:t>
+      </w:r>
+      <w:r>
+        <w:t>seem</w:t>
+      </w:r>
+      <w:r>
+        <w:t>s</w:t>
+      </w:r>
+      <w:r>
+        <w:t xml:space="preserve"> </w:t>
+      </w:r>
+      <w:r>
+        <w:t xml:space="preserve">to provide helpful, straightforward answers to which countries </w:t>
+      </w:r>
+      <w:r>
+        <w:t xml:space="preserve">give the most money </w:t>
+      </w:r>
+      <w:r>
+        <w:t xml:space="preserve">(e.g., Qatar, England, or China) </w:t>
+      </w:r>
+      <w:r>
+        <w:t xml:space="preserve">and therefore who UVA could target, but the reality is that </w:t>
+      </w:r>
+      <w:r>
+        <w:t xml:space="preserve">country-level analysis ignores the true donors in the dataset </w:t>
+      </w:r>
+      <w:r>
+        <w:t>—</w:t>
+      </w:r>
+      <w:r>
+        <w:t xml:space="preserve"> the actual individual giftors</w:t>
+      </w:r>
+      <w:r>
+        <w:t>/institutions</w:t>
+      </w:r>
+      <w:r>
+        <w:t xml:space="preserve">, many of whom </w:t>
+      </w:r>
+      <w:r>
+        <w:t xml:space="preserve">are not affiliated with the foreign government at all (e.g., private companies/foundations). </w:t>
+      </w:r>
+      <w:r>
+        <w:t xml:space="preserve">Even if </w:t>
+      </w:r>
+      <w:r>
+        <w:t xml:space="preserve">I </w:t>
+      </w:r>
+      <w:r>
+        <w:t xml:space="preserve">were to break </w:t>
+      </w:r>
+      <w:r>
+        <w:t xml:space="preserve">down country-level gifts for only UVA’s peers, ignoring the context behind these donations </w:t>
+      </w:r>
+      <w:r>
+        <w:t>does not provide very</w:t>
+      </w:r>
+      <w:r>
+        <w:t xml:space="preserve"> </w:t>
+      </w:r>
+      <w:r>
+        <w:t xml:space="preserve">helpful information for </w:t>
+      </w:r>
+      <w:r>
+        <w:t>funding strategies</w:t>
+      </w:r>
+      <w:r>
+        <w:t xml:space="preserve"> (e.g., </w:t>
+      </w:r>
+      <w:r>
+        <w:t xml:space="preserve">broadly </w:t>
+      </w:r>
+      <w:r>
+        <w:t xml:space="preserve">targeting </w:t>
+      </w:r>
+      <w:r>
+        <w:t>“England”</w:t>
+      </w:r>
+      <w:r>
+        <w:t xml:space="preserve"> is very different from targeting </w:t>
+      </w:r>
+      <w:r>
+        <w:t>GlaxoSmithKline, the UK-based pharmaceutical company</w:t>
+      </w:r>
+      <w:r>
+        <w:t>)</w:t>
+      </w:r>
+      <w:r>
+        <w:t xml:space="preserve">. </w:t>
+      </w:r>
+      <w:r>
+        <w:t xml:space="preserve">Therefore, </w:t>
+      </w:r>
+      <w:r>
+        <w:t xml:space="preserve">the results of </w:t>
+      </w:r>
+      <w:r>
+        <w:t>the</w:t>
+      </w:r>
+      <w:r>
+        <w:t xml:space="preserve"> initial analysis </w:t>
+      </w:r>
+      <w:r>
+        <w:t xml:space="preserve">are not sufficient for </w:t>
+      </w:r>
+      <w:r>
+        <w:t xml:space="preserve">truly </w:t>
+      </w:r>
+      <w:r>
+        <w:t>understanding the scope/trends in</w:t>
+      </w:r>
+      <w:r>
+        <w:t xml:space="preserve"> foreign</w:t>
+      </w:r>
+      <w:r>
+        <w:t xml:space="preserve"> gift giving, and for my UVA analysis, I </w:t>
+      </w:r>
+      <w:r>
+        <w:t>probed deeper by focusing on gifts over time, gift count by institution (not only country)</w:t>
+      </w:r>
+      <w:r>
+        <w:t>, and shared donors between UVA, UVA’s peers, and the market at large.</w:t>
+      </w:r>
+    </w:p>
+    <w:p>
+      <w:pPr>
+        <w:ind w:firstLine="720"/>
+      </w:pPr>
+      <w:r>
+        <w:t>First, i</w:t>
+      </w:r>
+      <w:r>
+        <w:t xml:space="preserve">n order to better understand the scope of the dataset, I </w:t>
+      </w:r>
+      <w:r>
+        <w:t xml:space="preserve">reformatted and summarized the </w:t>
+      </w:r>
+      <w:r>
+        <w:rPr>
+          <w:i/>
+          <w:iCs/>
+        </w:rPr>
+        <w:t>Foreign Gift Received Date</w:t>
+      </w:r>
+      <w:r>
+        <w:t xml:space="preserve"> column</w:t>
+      </w:r>
+      <w:r>
+        <w:t xml:space="preserve">. This investigation revealed that the Foreign Gifts dataset is a </w:t>
+      </w:r>
+      <w:r>
+        <w:rPr>
+          <w:b/>
+          <w:bCs/>
+        </w:rPr>
+        <w:t>snapshot</w:t>
+      </w:r>
+      <w:r>
+        <w:rPr>
+          <w:b/>
+          <w:bCs/>
+        </w:rPr>
+        <w:t xml:space="preserve"> of gift transactions from </w:t>
+      </w:r>
+      <w:r>
+        <w:rPr>
+          <w:b/>
+          <w:bCs/>
+        </w:rPr>
+        <w:t>2014-2020</w:t>
+      </w:r>
+      <w:r>
+        <w:t xml:space="preserve"> and</w:t>
+      </w:r>
+      <w:r>
+        <w:t xml:space="preserve"> th</w:t>
+      </w:r>
+      <w:r>
+        <w:t xml:space="preserve">us </w:t>
+      </w:r>
+      <w:r>
+        <w:t xml:space="preserve">should </w:t>
+      </w:r>
+      <w:r>
+        <w:t xml:space="preserve">be considered in this context. </w:t>
+      </w:r>
+      <w:r>
+        <w:t>For example, t</w:t>
+      </w:r>
+      <w:r>
+        <w:t>he</w:t>
+      </w:r>
+      <w:r>
+        <w:t xml:space="preserve"> data</w:t>
+      </w:r>
+      <w:r>
+        <w:t xml:space="preserve"> we’re working with are pre-Covid</w:t>
+      </w:r>
+      <w:r>
+        <w:t xml:space="preserve"> </w:t>
+      </w:r>
+      <w:r>
+        <w:t xml:space="preserve">numbers, so </w:t>
+      </w:r>
+      <w:r>
+        <w:t xml:space="preserve">any strategies we propose </w:t>
+      </w:r>
+      <w:r>
+        <w:t xml:space="preserve">from this data </w:t>
+      </w:r>
+      <w:r>
+        <w:t xml:space="preserve">inherently won’t </w:t>
+      </w:r>
+      <w:r>
+        <w:t>include how</w:t>
+      </w:r>
+      <w:r>
+        <w:t xml:space="preserve"> </w:t>
+      </w:r>
+      <w:r>
+        <w:t xml:space="preserve">the pandemic may have caused </w:t>
+      </w:r>
+      <w:r>
+        <w:t>changes in foreign relationships/opportunities</w:t>
+      </w:r>
+      <w:r>
+        <w:t xml:space="preserve"> (or how geopolitical relationships at large have shifted). </w:t>
+      </w:r>
+      <w:r>
+        <w:t xml:space="preserve">Despite a more limited timeframe of data </w:t>
+      </w:r>
+      <w:r>
+        <w:lastRenderedPageBreak/>
+        <w:t xml:space="preserve">than I anticipated, I still decided to use date as an important measure of </w:t>
+      </w:r>
+      <w:r>
+        <w:t>gift</w:t>
+      </w:r>
+      <w:r>
+        <w:t xml:space="preserve"> trends, as </w:t>
+      </w:r>
+      <w:r>
+        <w:t>it provide</w:t>
+      </w:r>
+      <w:r>
+        <w:t>d</w:t>
+      </w:r>
+      <w:r>
+        <w:t xml:space="preserve"> nuance beyond total gift count </w:t>
+      </w:r>
+      <w:r>
+        <w:t xml:space="preserve">to countries’ spending attitudes. For example, as I started my UVA analysis, </w:t>
+      </w:r>
+      <w:r>
+        <w:t>I was able to pinpoint top giftors for UVA not only by count but also by consistency over the years</w:t>
+      </w:r>
+      <w:r>
+        <w:t xml:space="preserve">, which revealed </w:t>
+      </w:r>
+      <w:r>
+        <w:t>long-term</w:t>
+      </w:r>
+      <w:r>
+        <w:t xml:space="preserve"> giving relationships with Bangladesh, Sweden</w:t>
+      </w:r>
+      <w:r>
+        <w:t>, and England</w:t>
+      </w:r>
+      <w:r>
+        <w:t xml:space="preserve">. As a further example, Bangladesh has given the most money to UVA </w:t>
+      </w:r>
+      <w:r>
+        <w:t>overall ($</w:t>
+      </w:r>
+      <w:r>
+        <w:t>4</w:t>
+      </w:r>
+      <w:r>
+        <w:t>,</w:t>
+      </w:r>
+      <w:r>
+        <w:t>228</w:t>
+      </w:r>
+      <w:r>
+        <w:t>,</w:t>
+      </w:r>
+      <w:r>
+        <w:t>589</w:t>
+      </w:r>
+      <w:r>
+        <w:t>) through 10 total gifts spanning five years</w:t>
+      </w:r>
+      <w:r>
+        <w:t xml:space="preserve"> (2014-2019)</w:t>
+      </w:r>
+      <w:r>
+        <w:t>, whereas Israel has only given UVA $</w:t>
+      </w:r>
+      <w:r>
+        <w:t>623</w:t>
+      </w:r>
+      <w:r>
+        <w:t>,</w:t>
+      </w:r>
+      <w:r>
+        <w:t>655</w:t>
+      </w:r>
+      <w:r>
+        <w:t xml:space="preserve"> over two years</w:t>
+      </w:r>
+      <w:r>
+        <w:t xml:space="preserve"> (2014, 2016)</w:t>
+      </w:r>
+      <w:r>
+        <w:t xml:space="preserve">, despite giving 12 total gifts. By investigating the date variable, we can see which countries </w:t>
+      </w:r>
+      <w:r>
+        <w:t xml:space="preserve">have a </w:t>
+      </w:r>
+      <w:r>
+        <w:t>consistent</w:t>
+      </w:r>
+      <w:r>
+        <w:t xml:space="preserve"> </w:t>
+      </w:r>
+      <w:r>
+        <w:t xml:space="preserve">giving </w:t>
+      </w:r>
+      <w:r>
+        <w:t xml:space="preserve">relationship with </w:t>
+      </w:r>
+      <w:r>
+        <w:t>UVA over</w:t>
+      </w:r>
+      <w:r>
+        <w:t xml:space="preserve"> time, which </w:t>
+      </w:r>
+      <w:r>
+        <w:t>gives</w:t>
+      </w:r>
+      <w:r>
+        <w:t xml:space="preserve"> UVA </w:t>
+      </w:r>
+      <w:r>
+        <w:t xml:space="preserve">the insight </w:t>
+      </w:r>
+      <w:r>
+        <w:t xml:space="preserve">to potentially prioritize these partnerships </w:t>
+      </w:r>
+      <w:r>
+        <w:t>in the future</w:t>
+      </w:r>
+      <w:r>
+        <w:t xml:space="preserve">. </w:t>
+      </w:r>
+    </w:p>
+    <w:p>
+      <w:r>
+        <w:t>Next, I investigated country-level and institution-level giv</w:t>
+      </w:r>
+      <w:r>
+        <w:t>ing</w:t>
+      </w:r>
+      <w:r>
+        <w:t xml:space="preserve"> between UVA and its peer schools. For my </w:t>
+      </w:r>
+      <w:r>
+        <w:t>analysis</w:t>
+      </w:r>
+      <w:r>
+        <w:t>, I decided to only include Virginia schools</w:t>
+      </w:r>
+      <w:r>
+        <w:t xml:space="preserve"> (rather than reaching into North Carolina</w:t>
+      </w:r>
+      <w:r>
+        <w:t xml:space="preserve"> for schools like UNC</w:t>
+      </w:r>
+      <w:r>
+        <w:t>)</w:t>
+      </w:r>
+      <w:r>
+        <w:t xml:space="preserve">, </w:t>
+      </w:r>
+      <w:r>
+        <w:t>because</w:t>
+      </w:r>
+      <w:r>
+        <w:t xml:space="preserve"> </w:t>
+      </w:r>
+      <w:r>
+        <w:t xml:space="preserve">the subset of Virginia schools in the dataset </w:t>
+      </w:r>
+      <w:r>
+        <w:t xml:space="preserve">provided meaningful comparisons in size, </w:t>
+      </w:r>
+      <w:r>
+        <w:t xml:space="preserve">academic rigor, and research focus (e.g., </w:t>
+      </w:r>
+      <w:r>
+        <w:t xml:space="preserve">all were larger public universities with </w:t>
+      </w:r>
+      <w:r>
+        <w:t>mid-</w:t>
+      </w:r>
+      <w:r>
+        <w:t>high academic standards).</w:t>
+      </w:r>
+      <w:r>
+        <w:t xml:space="preserve"> </w:t>
+      </w:r>
+      <w:r>
+        <w:t xml:space="preserve">My </w:t>
+      </w:r>
+      <w:r>
+        <w:t xml:space="preserve">initial </w:t>
+      </w:r>
+      <w:r>
+        <w:t xml:space="preserve">analysis </w:t>
+      </w:r>
+      <w:r>
+        <w:t>of</w:t>
+      </w:r>
+      <w:r>
+        <w:t xml:space="preserve"> UVA and other Virginia schools </w:t>
+      </w:r>
+      <w:r>
+        <w:t xml:space="preserve">first </w:t>
+      </w:r>
+      <w:r>
+        <w:t xml:space="preserve">suggested that UVA falls behind its peer institutions in </w:t>
+      </w:r>
+      <w:r>
+        <w:t>total gift sum and average gift size</w:t>
+      </w:r>
+      <w:r>
+        <w:t xml:space="preserve">, especially as compared to Virginia Commonwealth University </w:t>
+      </w:r>
+      <w:r>
+        <w:t xml:space="preserve">(VCU), which </w:t>
+      </w:r>
+      <w:r>
+        <w:t xml:space="preserve">has received $89 million </w:t>
+      </w:r>
+      <w:r>
+        <w:t xml:space="preserve">in total </w:t>
+      </w:r>
+      <w:r>
+        <w:t xml:space="preserve">gifts, with an average </w:t>
+      </w:r>
+      <w:r>
+        <w:t>gift size of $775,000, compared to UVA’s $22 million total and $</w:t>
+      </w:r>
+      <w:r>
+        <w:t xml:space="preserve">225,000 average. However, </w:t>
+      </w:r>
+      <w:r>
+        <w:t>after looking at the country-level, I noticed that the majority of VCU’s</w:t>
+      </w:r>
+      <w:r>
+        <w:t xml:space="preserve"> (and GMU’s) funds came from middle eastern countries like Qatar and Saudi Arabia, and if removed, would knock their totals and average gift sizes to below or equivalent to UVA</w:t>
+      </w:r>
+      <w:r>
+        <w:t xml:space="preserve">. </w:t>
+      </w:r>
+      <w:r>
+        <w:t>A</w:t>
+      </w:r>
+      <w:r>
+        <w:t xml:space="preserve">dditionally, </w:t>
+      </w:r>
+      <w:r>
+        <w:t xml:space="preserve">by removing </w:t>
+      </w:r>
+      <w:r>
+        <w:t xml:space="preserve">large spenders, </w:t>
+      </w:r>
+      <w:r>
+        <w:t xml:space="preserve">we can see that UVA otherwise has </w:t>
+      </w:r>
+      <w:r>
+        <w:t>most diverse AND consistent gift</w:t>
+      </w:r>
+      <w:r>
+        <w:t xml:space="preserve"> flow of all Virginia schools</w:t>
+      </w:r>
+      <w:r>
+        <w:t xml:space="preserve">, </w:t>
+      </w:r>
+      <w:r>
+        <w:t xml:space="preserve">suggesting a sustainability that other schools might lack. </w:t>
+      </w:r>
+      <w:r>
+        <w:t xml:space="preserve">With this full picture, trying to target the high-value donors </w:t>
+      </w:r>
+      <w:r>
+        <w:t>shared by other Virginia schools would be a smart strategy for UVA</w:t>
+      </w:r>
+      <w:r>
+        <w:t>, as they’ve already established a strong, consistent</w:t>
+      </w:r>
+      <w:r>
+        <w:t xml:space="preserve"> foundation of</w:t>
+      </w:r>
+      <w:r>
+        <w:t xml:space="preserve"> gift flow. </w:t>
+      </w:r>
+      <w:r>
+        <w:t xml:space="preserve">With this </w:t>
+      </w:r>
+      <w:r>
+        <w:t xml:space="preserve">strategy in mind, I then investigated both the country-level and institution-level of </w:t>
+      </w:r>
+      <w:r>
+        <w:t xml:space="preserve">high giftors at other institutions currently not shared by UVA. </w:t>
+      </w:r>
+      <w:r>
+        <w:t xml:space="preserve">I discovered that the Royal Embassy of Saudi Arabia, specifically the Saudi Arabian Cultural Mission, </w:t>
+      </w:r>
+      <w:r>
+        <w:t xml:space="preserve">have given millions of dollars to both GMU and </w:t>
+      </w:r>
+      <w:r>
+        <w:t>W&amp;M</w:t>
+      </w:r>
+      <w:r>
+        <w:t xml:space="preserve">. </w:t>
+      </w:r>
+      <w:r>
+        <w:t xml:space="preserve">Notably, GMU’s donor is only listed as “The Royal Embassy of Saudi Arabia,” but through additional research I uncovered that </w:t>
+      </w:r>
+      <w:r>
+        <w:t xml:space="preserve">GMU’s Saudi funding  was specifically </w:t>
+      </w:r>
+      <w:r>
+        <w:t>“</w:t>
+      </w:r>
+      <w:r>
+        <w:t>a contractual arrangement with the Saudi Arabian Cultural Mission to collect tuition and fees</w:t>
+      </w:r>
+      <w:r>
+        <w:t xml:space="preserve"> </w:t>
+      </w:r>
+      <w:r>
+        <w:t>for students who receive Saudi government scholarships</w:t>
+      </w:r>
+      <w:r>
+        <w:t>”</w:t>
+      </w:r>
+      <w:r>
+        <w:t xml:space="preserve"> (per an </w:t>
+      </w:r>
+      <w:hyperlink r:id="rId4" w:history="1">
+        <w:r>
+          <w:rPr>
+            <w:rStyle w:val="Hyperlink"/>
+            <w:i/>
+            <w:iCs/>
+          </w:rPr>
+          <w:t>Inside Higher E</w:t>
+        </w:r>
+        <w:r>
+          <w:rPr>
+            <w:rStyle w:val="Hyperlink"/>
+            <w:i/>
+            <w:iCs/>
+          </w:rPr>
+          <w:t>d</w:t>
+        </w:r>
+        <w:r>
+          <w:rPr>
+            <w:rStyle w:val="Hyperlink"/>
+            <w:i/>
+            <w:iCs/>
+          </w:rPr>
+          <w:t xml:space="preserve"> </w:t>
+        </w:r>
+        <w:r>
+          <w:rPr>
+            <w:rStyle w:val="Hyperlink"/>
+          </w:rPr>
+          <w:t>article</w:t>
+        </w:r>
+      </w:hyperlink>
+      <w:r>
+        <w:t xml:space="preserve">), </w:t>
+      </w:r>
+      <w:r>
+        <w:t>and therefore fell under SACM like W&amp;M. Additionally,</w:t>
+      </w:r>
+      <w:r>
+        <w:t xml:space="preserve"> my</w:t>
+      </w:r>
+      <w:r>
+        <w:t xml:space="preserve"> </w:t>
+      </w:r>
+      <w:r>
+        <w:t>research further revealed that the SACM headquarters in located in northern Virginia</w:t>
+      </w:r>
+      <w:r>
+        <w:t xml:space="preserve">, which makes it </w:t>
+      </w:r>
+      <w:r>
+        <w:t>an even more accessible target for UVA.</w:t>
+      </w:r>
+    </w:p>
+    <w:p>
+      <w:pPr>
+        <w:ind w:firstLine="720"/>
+      </w:pPr>
+      <w:r>
+        <w:lastRenderedPageBreak/>
+        <w:t>With this institution-level framework in mind, I th</w:t>
+      </w:r>
+      <w:r>
+        <w:t>en expanded my analysis back to the market at large</w:t>
+      </w:r>
+      <w:r>
+        <w:t xml:space="preserve"> to discover institutions who give consistently to a high number of unique schools, as well as </w:t>
+      </w:r>
+      <w:r>
+        <w:t xml:space="preserve">if other non-UVA Virginia schools have connections to these top donors. To </w:t>
+      </w:r>
+      <w:r>
+        <w:t xml:space="preserve">decide which country’s institutions to focus on, I filtered countries by those who gave gifts to the highest number of unique </w:t>
+      </w:r>
+      <w:r>
+        <w:t>schools and</w:t>
+      </w:r>
+      <w:r>
+        <w:t xml:space="preserve"> then </w:t>
+      </w:r>
+      <w:r>
+        <w:t xml:space="preserve">filtered further </w:t>
+      </w:r>
+      <w:r>
+        <w:t>for</w:t>
+      </w:r>
+      <w:r>
+        <w:t xml:space="preserve"> </w:t>
+      </w:r>
+      <w:r>
+        <w:t xml:space="preserve">those who gave </w:t>
+      </w:r>
+      <w:r>
+        <w:rPr>
+          <w:i/>
+          <w:iCs/>
+        </w:rPr>
+        <w:t xml:space="preserve">consistently </w:t>
+      </w:r>
+      <w:r>
+        <w:t xml:space="preserve">(i.e., more than two years) to </w:t>
+      </w:r>
+      <w:r>
+        <w:t>the most schools. From this list, I</w:t>
+      </w:r>
+      <w:r>
+        <w:t xml:space="preserve"> chose the top five and gave lists of all of their individual donors to ChatGPT to help me create a mapping </w:t>
+      </w:r>
+      <w:r>
+        <w:t>function for standardization. A more thorough cleaning/standardization w</w:t>
+      </w:r>
+      <w:r>
+        <w:t>ould</w:t>
+      </w:r>
+      <w:r>
+        <w:t xml:space="preserve"> definitely</w:t>
+      </w:r>
+      <w:r>
+        <w:t xml:space="preserve"> be</w:t>
+      </w:r>
+      <w:r>
+        <w:t xml:space="preserve"> </w:t>
+      </w:r>
+      <w:r>
+        <w:t>possible but</w:t>
+      </w:r>
+      <w:r>
+        <w:t xml:space="preserve"> doing it this way</w:t>
+      </w:r>
+      <w:r>
+        <w:t xml:space="preserve"> gave me the ability to spot meaningful trends</w:t>
+      </w:r>
+      <w:r>
+        <w:t xml:space="preserve"> without sacrificing too much time. </w:t>
+      </w:r>
+      <w:r>
+        <w:t xml:space="preserve">After cleaning up giftor names, I investigated the top individual donors by </w:t>
+      </w:r>
+      <w:r>
+        <w:t>gift count</w:t>
+      </w:r>
+      <w:r>
+        <w:t xml:space="preserve"> per unique school</w:t>
+      </w:r>
+      <w:r>
+        <w:t xml:space="preserve">, and </w:t>
+      </w:r>
+      <w:r>
+        <w:t xml:space="preserve">the </w:t>
+      </w:r>
+      <w:r>
+        <w:t>Saudi Arabia</w:t>
+      </w:r>
+      <w:r>
+        <w:t xml:space="preserve">n Cultural Mission was revealed to be the </w:t>
+      </w:r>
+      <w:r>
+        <w:t>top giftor, further solidifying them as a top target for UVA.</w:t>
+      </w:r>
+    </w:p>
+    <w:p>
+      <w:r>
+        <w:br w:type="page"/>
+      </w:r>
+    </w:p>
+    <w:p>
+      <w:pPr>
+        <w:ind w:firstLine="720"/>
+      </w:pPr>
+    </w:p>
+    <w:p>
+      <w:pPr>
+        <w:ind w:firstLine="720"/>
+      </w:pPr>
+    </w:p>
+    <w:p>
+      <w:pPr>
+        <w:ind w:firstLine="720"/>
+      </w:pPr>
+    </w:p>
+    <w:p>
+      <w:pPr>
+        <w:ind w:firstLine="720"/>
+      </w:pPr>
+    </w:p>
+    <w:p>
+      <w:pPr>
+        <w:ind w:firstLine="720"/>
+      </w:pPr>
+      <w:r>
+        <w:t>This</w:t>
+      </w:r>
+      <w:r>
+        <w:t xml:space="preserve"> part of the analysis also revealed </w:t>
+      </w:r>
+      <w:r>
+        <w:t xml:space="preserve">that </w:t>
+      </w:r>
+      <w:r>
+        <w:t xml:space="preserve">additional cleaning </w:t>
+      </w:r>
+      <w:r>
+        <w:t xml:space="preserve">was </w:t>
+      </w:r>
+      <w:r>
+        <w:t>needed for the institution-level giftor names</w:t>
+      </w:r>
+      <w:r>
+        <w:t>, as many of the “giftors” would be listed as unique</w:t>
+      </w:r>
+      <w:r>
+        <w:t xml:space="preserve"> due to inconsistencies in spelling/format. Once I realized this, I </w:t>
+      </w:r>
+    </w:p>
+    <w:p>
+      <w:pPr>
+        <w:ind w:firstLine="720"/>
+      </w:pPr>
+    </w:p>
+    <w:p>
+      <w:pPr>
+        <w:ind w:firstLine="720"/>
+      </w:pPr>
+    </w:p>
+    <w:p>
+      <w:pPr>
+        <w:ind w:firstLine="720"/>
+      </w:pPr>
+      <w:r>
+        <w:rPr>
+          <w:noProof/>
+        </w:rPr>
+        <w:t xml:space="preserve"> </w:t>
+      </w:r>
+    </w:p>
+    <w:p>
+      <w:pPr>
+        <w:ind w:firstLine="720"/>
+      </w:pPr>
     </w:p>
     <w:p/>
     <w:p>
       <w:r>
+        <w:t xml:space="preserve">For example, </w:t>
+      </w:r>
+      <w:proofErr w:type="gramStart"/>
+      <w:r>
+        <w:t>With</w:t>
+      </w:r>
+      <w:proofErr w:type="gramEnd"/>
+      <w:r>
+        <w:t xml:space="preserve"> this information</w:t>
+      </w:r>
+      <w:r>
+        <w:t xml:space="preserve">, I was able to start my UVA analysis with a baseline of </w:t>
+      </w:r>
+    </w:p>
+    <w:p/>
+    <w:p>
+      <w:r>
+        <w:t>The Foreign Gifts dataset is deceptively straightforward if you only focus on country-level gift analyses.</w:t>
+      </w:r>
+      <w:r>
+        <w:t xml:space="preserve"> For example, </w:t>
+      </w:r>
+      <w:r>
+        <w:t>we can</w:t>
+      </w:r>
+      <w:r>
+        <w:t xml:space="preserve"> easily</w:t>
+      </w:r>
+      <w:r>
+        <w:t xml:space="preserve"> identify </w:t>
+      </w:r>
+      <w:r>
+        <w:t xml:space="preserve">which </w:t>
+      </w:r>
+      <w:r>
+        <w:t>countries give the most money</w:t>
+      </w:r>
+      <w:r>
+        <w:t xml:space="preserve"> (e.g., Qatar, England, China, and Saudi Arabia have all given over $1 billion in total gifts</w:t>
+      </w:r>
+      <w:r>
+        <w:t>) or the most gifts by count</w:t>
+      </w:r>
+      <w:r>
+        <w:t xml:space="preserve">, as well as the </w:t>
+      </w:r>
+      <w:r>
+        <w:t xml:space="preserve">top universities who receive these funds (e.g., Carnegie Mellon University and Cornell University). </w:t>
+      </w:r>
+      <w:r>
+        <w:t>We can also summarize</w:t>
+      </w:r>
+      <w:r>
+        <w:t xml:space="preserve"> at the </w:t>
+      </w:r>
+      <w:r>
+        <w:t>university level</w:t>
+      </w:r>
+      <w:r>
+        <w:t xml:space="preserve"> how the distribution of funds </w:t>
+      </w:r>
+      <w:r>
+        <w:t>differs</w:t>
+      </w:r>
+      <w:r>
+        <w:t xml:space="preserve"> (e.g., the mean of total gift sum per school is around $52 million and the median is closer to $6.5</w:t>
+      </w:r>
+      <w:r>
+        <w:t xml:space="preserve"> million), </w:t>
+      </w:r>
+      <w:r>
+        <w:t xml:space="preserve">and see that </w:t>
+      </w:r>
+    </w:p>
+    <w:p/>
+    <w:p>
+      <w:r>
+        <w:t>Through the</w:t>
+      </w:r>
+      <w:r>
+        <w:t xml:space="preserve"> additional</w:t>
+      </w:r>
+      <w:r>
+        <w:t xml:space="preserve"> exploration of the Foreign Gifts dataset, we can see that </w:t>
+      </w:r>
+      <w:r>
+        <w:t xml:space="preserve">measuring </w:t>
+      </w:r>
+      <w:r>
+        <w:t>the</w:t>
+      </w:r>
+      <w:r>
+        <w:t xml:space="preserve"> true</w:t>
+      </w:r>
+      <w:r>
+        <w:t xml:space="preserve"> scope of foreign gifts to universities is </w:t>
+      </w:r>
+      <w:r>
+        <w:t>much more complex.</w:t>
+      </w:r>
+    </w:p>
+    <w:p/>
+    <w:p>
+      <w:r>
+        <w:t xml:space="preserve">The Foreign Gifts dataset </w:t>
+      </w:r>
+      <w:r>
+        <w:t xml:space="preserve">is deceptively straightforward </w:t>
+      </w:r>
+      <w:r>
+        <w:t xml:space="preserve">if you </w:t>
+      </w:r>
+      <w:r>
+        <w:t xml:space="preserve">only focus on </w:t>
+      </w:r>
+      <w:r>
+        <w:t xml:space="preserve">country-level gift analyses. </w:t>
+      </w:r>
+      <w:r>
+        <w:t>Th</w:t>
+      </w:r>
+      <w:r>
+        <w:t xml:space="preserve">rough the </w:t>
+      </w:r>
+      <w:r>
+        <w:rPr>
+          <w:i/>
+          <w:iCs/>
+        </w:rPr>
+        <w:t xml:space="preserve">Initial Analyses </w:t>
+      </w:r>
+      <w:r>
+        <w:t>section of the lab,</w:t>
+      </w:r>
+      <w:r>
+        <w:t xml:space="preserve"> </w:t>
+      </w:r>
+      <w:r>
+        <w:t xml:space="preserve">I was able to feel comfortable with surface level trends in the data: </w:t>
+      </w:r>
+      <w:proofErr w:type="spellStart"/>
+      <w:r>
+        <w:t>ther</w:t>
+      </w:r>
+      <w:proofErr w:type="spellEnd"/>
+    </w:p>
+    <w:p>
+      <w:r>
+        <w:t>At first glance, analyzing this dataset appears straightforward enough.</w:t>
+      </w:r>
+    </w:p>
+    <w:p/>
+    <w:p>
+      <w:r>
+        <w:t>Average amount each university receives</w:t>
+      </w:r>
+      <w:proofErr w:type="gramStart"/>
+      <w:r>
+        <w:t>:  $</w:t>
+      </w:r>
+      <w:proofErr w:type="gramEnd"/>
+      <w:r>
+        <w:t>52,202,879</w:t>
+      </w:r>
+    </w:p>
+    <w:p>
+      <w:r>
+        <w:t>Median amount each university receives</w:t>
+      </w:r>
+      <w:proofErr w:type="gramStart"/>
+      <w:r>
+        <w:t>:  $</w:t>
+      </w:r>
+      <w:proofErr w:type="gramEnd"/>
+      <w:r>
+        <w:t>6,486,792</w:t>
+      </w:r>
+    </w:p>
+    <w:p/>
+    <w:p>
+      <w:r>
+        <w:t xml:space="preserve">Dates for this spreadsheet all fall between 2014-2020, so this is merely a snapshot of </w:t>
+      </w:r>
+      <w:r>
+        <w:t>foreign funding. Additionally, the data can provide limited insight into how Covid might have affected funding relationships/opportunities.</w:t>
+      </w:r>
+    </w:p>
+    <w:p/>
+    <w:p>
+      <w:r>
+        <w:t xml:space="preserve">Looking only at the </w:t>
+      </w:r>
+      <w:proofErr w:type="gramStart"/>
+      <w:r>
+        <w:t>country-level</w:t>
+      </w:r>
+      <w:proofErr w:type="gramEnd"/>
+      <w:r>
+        <w:t xml:space="preserve"> is misleading. The fact is that funding </w:t>
+      </w:r>
+      <w:proofErr w:type="gramStart"/>
+      <w:r>
+        <w:t>comes</w:t>
+      </w:r>
+      <w:proofErr w:type="gramEnd"/>
+      <w:r>
+        <w:t xml:space="preserve"> specific donors within that country, not </w:t>
+      </w:r>
+      <w:proofErr w:type="gramStart"/>
+      <w:r>
+        <w:t>a nebulous</w:t>
+      </w:r>
+      <w:proofErr w:type="gramEnd"/>
+      <w:r>
+        <w:t xml:space="preserve"> </w:t>
+      </w:r>
+    </w:p>
+    <w:p>
+      <w:r>
+        <w:t>UVA average vs. all school average</w:t>
+      </w:r>
+    </w:p>
+    <w:p>
+      <w:r>
         <w:t>Date range of gifts</w:t>
       </w:r>
       <w:r>
@@ -66,14 +1186,112 @@
     <w:p/>
     <w:p>
       <w:r>
+        <w:t xml:space="preserve">At first glance, </w:t>
+      </w:r>
+      <w:r>
+        <w:t xml:space="preserve">VCU seems to have found a sweet spot of </w:t>
+      </w:r>
+      <w:r>
+        <w:t>many gifts with high avg</w:t>
+      </w:r>
+      <w:r>
+        <w:t xml:space="preserve">, but further investigation reveals </w:t>
+      </w:r>
+      <w:r>
+        <w:t xml:space="preserve">most money comes from one source. Uva is technically the most “balanced” of </w:t>
+      </w:r>
+      <w:proofErr w:type="spellStart"/>
+      <w:r>
+        <w:t>va</w:t>
+      </w:r>
+      <w:proofErr w:type="spellEnd"/>
+      <w:r>
+        <w:t xml:space="preserve"> schools in terms of donations (most gifts across </w:t>
+      </w:r>
+      <w:r>
+        <w:t>most unique countries)</w:t>
+      </w:r>
+    </w:p>
+    <w:p/>
+    <w:p/>
+    <w:p/>
+    <w:p>
+      <w:r>
+        <w:t>“</w:t>
+      </w:r>
+      <w:r>
+        <w:t>a contractual arrangement with the Saudi Arabian Cultural Mission to collect tuition and fees for students who receive Saudi government scholarships</w:t>
+      </w:r>
+      <w:r>
+        <w:t xml:space="preserve">.” </w:t>
+      </w:r>
+      <w:r>
+        <w:t xml:space="preserve"> </w:t>
+      </w:r>
+      <w:r>
+        <w:t>https://www.insidehighered.com/news/2018/11/08/colleges-are-called-upon-review-their-collaborations-saudi-arabia-after-khashoggi</w:t>
+      </w:r>
+    </w:p>
+    <w:p/>
+    <w:p>
+      <w:pPr>
+        <w:rPr>
+          <w:b/>
+          <w:bCs/>
+        </w:rPr>
+      </w:pPr>
+      <w:r>
+        <w:rPr>
+          <w:b/>
+          <w:bCs/>
+        </w:rPr>
         <w:t>Proposed Strategy:</w:t>
       </w:r>
+      <w:r>
+        <w:rPr>
+          <w:b/>
+          <w:bCs/>
+        </w:rPr>
+        <w:t xml:space="preserve"> </w:t>
+      </w:r>
+      <w:r>
+        <w:rPr>
+          <w:b/>
+          <w:bCs/>
+        </w:rPr>
+        <w:t>Describe a strategy for finding new potential sources of money for UVA. What countries or institutions should UVA target, and why? (1-3 paragraphs)</w:t>
+      </w:r>
     </w:p>
     <w:p/>
     <w:p>
-      <w:r>
+      <w:pPr>
+        <w:rPr>
+          <w:b/>
+          <w:bCs/>
+        </w:rPr>
+      </w:pPr>
+      <w:r>
+        <w:rPr>
+          <w:b/>
+          <w:bCs/>
+        </w:rPr>
+        <w:lastRenderedPageBreak/>
         <w:t>Conclusion:</w:t>
       </w:r>
+      <w:r>
+        <w:rPr>
+          <w:b/>
+          <w:bCs/>
+        </w:rPr>
+        <w:t xml:space="preserve"> </w:t>
+      </w:r>
+      <w:r>
+        <w:rPr>
+          <w:b/>
+          <w:bCs/>
+        </w:rPr>
+        <w:t>Conclude with a summary of UVA's prospects for increasing foreign giving. (1 paragraph).</w:t>
+      </w:r>
     </w:p>
     <w:p/>
     <w:p>
@@ -83,7 +1301,15 @@
     </w:p>
     <w:p>
       <w:r>
-        <w:t>     2. Summarize the results of your initial analyses of overall giving and giving to UVA (1-3 paragraphs).</w:t>
+        <w:t xml:space="preserve">     2. Summarize the results of your initial </w:t>
+      </w:r>
+      <w:proofErr w:type="gramStart"/>
+      <w:r>
+        <w:t>analyses</w:t>
+      </w:r>
+      <w:proofErr w:type="gramEnd"/>
+      <w:r>
+        <w:t xml:space="preserve"> of overall giving and giving to UVA (1-3 paragraphs).</w:t>
       </w:r>
     </w:p>
     <w:p>
@@ -1023,6 +2249,41 @@
       <w:spacing w:val="5"/>
     </w:rPr>
   </w:style>
+  <w:style w:type="character" w:styleId="Hyperlink">
+    <w:name w:val="Hyperlink"/>
+    <w:basedOn w:val="DefaultParagraphFont"/>
+    <w:uiPriority w:val="99"/>
+    <w:unhideWhenUsed/>
+    <w:rsid w:val="00AA3410"/>
+    <w:rPr>
+      <w:color w:val="467886" w:themeColor="hyperlink"/>
+      <w:u w:val="single"/>
+    </w:rPr>
+  </w:style>
+  <w:style w:type="character" w:styleId="UnresolvedMention">
+    <w:name w:val="Unresolved Mention"/>
+    <w:basedOn w:val="DefaultParagraphFont"/>
+    <w:uiPriority w:val="99"/>
+    <w:semiHidden/>
+    <w:unhideWhenUsed/>
+    <w:rsid w:val="00AA3410"/>
+    <w:rPr>
+      <w:color w:val="605E5C"/>
+      <w:shd w:val="clear" w:color="auto" w:fill="E1DFDD"/>
+    </w:rPr>
+  </w:style>
+  <w:style w:type="character" w:styleId="FollowedHyperlink">
+    <w:name w:val="FollowedHyperlink"/>
+    <w:basedOn w:val="DefaultParagraphFont"/>
+    <w:uiPriority w:val="99"/>
+    <w:semiHidden/>
+    <w:unhideWhenUsed/>
+    <w:rsid w:val="002D78B6"/>
+    <w:rPr>
+      <w:color w:val="96607D" w:themeColor="followedHyperlink"/>
+      <w:u w:val="single"/>
+    </w:rPr>
+  </w:style>
 </w:styles>
 </file>
 

</xml_diff>